<commit_message>
Aggiornamento codice AJAX e doc sprint 3
</commit_message>
<xml_diff>
--- a/3_Documentazione/da aggiungere alla doc sprint 3.docx
+++ b/3_Documentazione/da aggiungere alla doc sprint 3.docx
@@ -1023,14 +1023,24 @@
       <w:r>
         <w:t xml:space="preserve">Figura </w:t>
       </w:r>
-      <w:fldSimple w:instr=" SEQ Figura \* ARABIC ">
-        <w:r>
-          <w:rPr>
-            <w:noProof/>
-          </w:rPr>
-          <w:t>1</w:t>
-        </w:r>
-      </w:fldSimple>
+      <w:r>
+        <w:fldChar w:fldCharType="begin"/>
+      </w:r>
+      <w:r>
+        <w:instrText xml:space="preserve"> SEQ Figura \* ARABIC </w:instrText>
+      </w:r>
+      <w:r>
+        <w:fldChar w:fldCharType="separate"/>
+      </w:r>
+      <w:r>
+        <w:rPr>
+          <w:noProof/>
+        </w:rPr>
+        <w:t>1</w:t>
+      </w:r>
+      <w:r>
+        <w:fldChar w:fldCharType="end"/>
+      </w:r>
       <w:r>
         <w:t>: Pagina "</w:t>
       </w:r>
@@ -1107,14 +1117,24 @@
       <w:r>
         <w:t xml:space="preserve">Figura </w:t>
       </w:r>
-      <w:fldSimple w:instr=" SEQ Figura \* ARABIC ">
-        <w:r>
-          <w:rPr>
-            <w:noProof/>
-          </w:rPr>
-          <w:t>2</w:t>
-        </w:r>
-      </w:fldSimple>
+      <w:r>
+        <w:fldChar w:fldCharType="begin"/>
+      </w:r>
+      <w:r>
+        <w:instrText xml:space="preserve"> SEQ Figura \* ARABIC </w:instrText>
+      </w:r>
+      <w:r>
+        <w:fldChar w:fldCharType="separate"/>
+      </w:r>
+      <w:r>
+        <w:rPr>
+          <w:noProof/>
+        </w:rPr>
+        <w:t>2</w:t>
+      </w:r>
+      <w:r>
+        <w:fldChar w:fldCharType="end"/>
+      </w:r>
       <w:r>
         <w:t>: Conferma di creazione</w:t>
       </w:r>
@@ -1197,14 +1217,24 @@
       <w:r>
         <w:t xml:space="preserve">Figura </w:t>
       </w:r>
-      <w:fldSimple w:instr=" SEQ Figura \* ARABIC ">
-        <w:r>
-          <w:rPr>
-            <w:noProof/>
-          </w:rPr>
-          <w:t>3</w:t>
-        </w:r>
-      </w:fldSimple>
+      <w:r>
+        <w:fldChar w:fldCharType="begin"/>
+      </w:r>
+      <w:r>
+        <w:instrText xml:space="preserve"> SEQ Figura \* ARABIC </w:instrText>
+      </w:r>
+      <w:r>
+        <w:fldChar w:fldCharType="separate"/>
+      </w:r>
+      <w:r>
+        <w:rPr>
+          <w:noProof/>
+        </w:rPr>
+        <w:t>3</w:t>
+      </w:r>
+      <w:r>
+        <w:fldChar w:fldCharType="end"/>
+      </w:r>
       <w:r>
         <w:t>: Visualizzazione nell'elenco</w:t>
       </w:r>
@@ -1268,14 +1298,24 @@
       <w:r>
         <w:t xml:space="preserve">Figura </w:t>
       </w:r>
-      <w:fldSimple w:instr=" SEQ Figura \* ARABIC ">
-        <w:r>
-          <w:rPr>
-            <w:noProof/>
-          </w:rPr>
-          <w:t>4</w:t>
-        </w:r>
-      </w:fldSimple>
+      <w:r>
+        <w:fldChar w:fldCharType="begin"/>
+      </w:r>
+      <w:r>
+        <w:instrText xml:space="preserve"> SEQ Figura \* ARABIC </w:instrText>
+      </w:r>
+      <w:r>
+        <w:fldChar w:fldCharType="separate"/>
+      </w:r>
+      <w:r>
+        <w:rPr>
+          <w:noProof/>
+        </w:rPr>
+        <w:t>4</w:t>
+      </w:r>
+      <w:r>
+        <w:fldChar w:fldCharType="end"/>
+      </w:r>
       <w:r>
         <w:t>: Visualizzazione nel catalogo</w:t>
       </w:r>
@@ -1298,161 +1338,6 @@
         <w:pStyle w:val="Titolo1"/>
       </w:pPr>
       <w:bookmarkStart w:id="1" w:name="_Toc195104103"/>
-      <w:r>
-        <w:lastRenderedPageBreak/>
-        <w:t>Modifica di un prodotto</w:t>
-      </w:r>
-    </w:p>
-    <w:p>
-      <w:r>
-        <w:t>Per</w:t>
-      </w:r>
-      <w:r>
-        <w:t xml:space="preserve"> la modifica</w:t>
-      </w:r>
-      <w:bookmarkStart w:id="2" w:name="_GoBack"/>
-      <w:bookmarkEnd w:id="2"/>
-      <w:r>
-        <w:t xml:space="preserve"> di un prodotto</w:t>
-      </w:r>
-      <w:r>
-        <w:t xml:space="preserve"> bisogna accedere alla pagina “</w:t>
-      </w:r>
-      <w:proofErr w:type="spellStart"/>
-      <w:r>
-        <w:t>add</w:t>
-      </w:r>
-      <w:proofErr w:type="spellEnd"/>
-      <w:r>
-        <w:t>”,</w:t>
-      </w:r>
-      <w:r>
-        <w:t xml:space="preserve"> contenente un form </w:t>
-      </w:r>
-      <w:r>
-        <w:t>che richiede</w:t>
-      </w:r>
-      <w:r>
-        <w:t xml:space="preserve"> l’inserimento</w:t>
-      </w:r>
-      <w:r>
-        <w:t xml:space="preserve"> di informazioni</w:t>
-      </w:r>
-      <w:r>
-        <w:t xml:space="preserve"> e immagini del prodotto. Una volta inviati i dati, questi vengono passati tramite POST al metodo </w:t>
-      </w:r>
-      <w:proofErr w:type="gramStart"/>
-      <w:r>
-        <w:t>upload(</w:t>
-      </w:r>
-      <w:proofErr w:type="gramEnd"/>
-      <w:r>
-        <w:t xml:space="preserve">) del </w:t>
-      </w:r>
-      <w:proofErr w:type="spellStart"/>
-      <w:r>
-        <w:t>VendorController</w:t>
-      </w:r>
-      <w:proofErr w:type="spellEnd"/>
-      <w:r>
-        <w:t>.</w:t>
-      </w:r>
-    </w:p>
-    <w:p>
-      <w:r>
-        <w:t>Il sistema crea un nuovo record nella tabella products, e se sono presenti immagini:</w:t>
-      </w:r>
-    </w:p>
-    <w:p>
-      <w:pPr>
-        <w:numPr>
-          <w:ilvl w:val="0"/>
-          <w:numId w:val="1"/>
-        </w:numPr>
-        <w:spacing w:after="0"/>
-      </w:pPr>
-      <w:r>
-        <w:t>Vengono rinominate con un codice univoco.</w:t>
-      </w:r>
-    </w:p>
-    <w:p>
-      <w:pPr>
-        <w:numPr>
-          <w:ilvl w:val="0"/>
-          <w:numId w:val="1"/>
-        </w:numPr>
-        <w:spacing w:after="0"/>
-      </w:pPr>
-      <w:r>
-        <w:t>Salvate nella cartella public/</w:t>
-      </w:r>
-      <w:proofErr w:type="spellStart"/>
-      <w:r>
-        <w:t>productImages</w:t>
-      </w:r>
-      <w:proofErr w:type="spellEnd"/>
-      <w:r>
-        <w:t>/</w:t>
-      </w:r>
-      <w:r>
-        <w:t xml:space="preserve"> (tramite metodo</w:t>
-      </w:r>
-      <w:r>
-        <w:t xml:space="preserve"> “</w:t>
-      </w:r>
-      <w:r>
-        <w:t>store</w:t>
-      </w:r>
-      <w:r>
-        <w:t>”</w:t>
-      </w:r>
-      <w:r>
-        <w:t>)</w:t>
-      </w:r>
-      <w:r>
-        <w:t>.</w:t>
-      </w:r>
-    </w:p>
-    <w:p>
-      <w:pPr>
-        <w:numPr>
-          <w:ilvl w:val="0"/>
-          <w:numId w:val="1"/>
-        </w:numPr>
-        <w:spacing w:after="0"/>
-      </w:pPr>
-      <w:r>
-        <w:t>Il percorso relativo dell’immagine viene memorizzato nel database nella tabella images.</w:t>
-      </w:r>
-    </w:p>
-    <w:p>
-      <w:r>
-        <w:t>Se l’operazione va a buon fine, il vendor viene reindirizzato alla pagina precedente con un messaggio di conferma</w:t>
-      </w:r>
-      <w:r>
-        <w:t>, altrimenti uno di errore</w:t>
-      </w:r>
-      <w:r>
-        <w:t>.</w:t>
-      </w:r>
-    </w:p>
-    <w:p>
-      <w:pPr>
-        <w:rPr>
-          <w:rFonts w:asciiTheme="majorHAnsi" w:eastAsiaTheme="majorEastAsia" w:hAnsiTheme="majorHAnsi" w:cstheme="majorBidi"/>
-          <w:color w:val="2F5496" w:themeColor="accent1" w:themeShade="BF"/>
-          <w:sz w:val="32"/>
-          <w:szCs w:val="32"/>
-        </w:rPr>
-      </w:pPr>
-      <w:r>
-        <w:br w:type="page"/>
-      </w:r>
-    </w:p>
-    <w:p>
-      <w:pPr>
-        <w:pStyle w:val="Titolo1"/>
-      </w:pPr>
       <w:r>
         <w:lastRenderedPageBreak/>
         <w:t>Gestione errori</w:t>
@@ -1687,14 +1572,24 @@
       <w:r>
         <w:t xml:space="preserve">Figura </w:t>
       </w:r>
-      <w:fldSimple w:instr=" SEQ Figura \* ARABIC ">
-        <w:r>
-          <w:rPr>
-            <w:noProof/>
-          </w:rPr>
-          <w:t>5</w:t>
-        </w:r>
-      </w:fldSimple>
+      <w:r>
+        <w:fldChar w:fldCharType="begin"/>
+      </w:r>
+      <w:r>
+        <w:instrText xml:space="preserve"> SEQ Figura \* ARABIC </w:instrText>
+      </w:r>
+      <w:r>
+        <w:fldChar w:fldCharType="separate"/>
+      </w:r>
+      <w:r>
+        <w:rPr>
+          <w:noProof/>
+        </w:rPr>
+        <w:t>5</w:t>
+      </w:r>
+      <w:r>
+        <w:fldChar w:fldCharType="end"/>
+      </w:r>
       <w:r>
         <w:t xml:space="preserve">: </w:t>
       </w:r>
@@ -1762,14 +1657,24 @@
       <w:r>
         <w:t xml:space="preserve">Figura </w:t>
       </w:r>
-      <w:fldSimple w:instr=" SEQ Figura \* ARABIC ">
-        <w:r>
-          <w:rPr>
-            <w:noProof/>
-          </w:rPr>
-          <w:t>6</w:t>
-        </w:r>
-      </w:fldSimple>
+      <w:r>
+        <w:fldChar w:fldCharType="begin"/>
+      </w:r>
+      <w:r>
+        <w:instrText xml:space="preserve"> SEQ Figura \* ARABIC </w:instrText>
+      </w:r>
+      <w:r>
+        <w:fldChar w:fldCharType="separate"/>
+      </w:r>
+      <w:r>
+        <w:rPr>
+          <w:noProof/>
+        </w:rPr>
+        <w:t>6</w:t>
+      </w:r>
+      <w:r>
+        <w:fldChar w:fldCharType="end"/>
+      </w:r>
       <w:r>
         <w:t xml:space="preserve">: </w:t>
       </w:r>
@@ -1842,14 +1747,24 @@
       <w:r>
         <w:t xml:space="preserve">Figura </w:t>
       </w:r>
-      <w:fldSimple w:instr=" SEQ Figura \* ARABIC ">
-        <w:r>
-          <w:rPr>
-            <w:noProof/>
-          </w:rPr>
-          <w:t>7</w:t>
-        </w:r>
-      </w:fldSimple>
+      <w:r>
+        <w:fldChar w:fldCharType="begin"/>
+      </w:r>
+      <w:r>
+        <w:instrText xml:space="preserve"> SEQ Figura \* ARABIC </w:instrText>
+      </w:r>
+      <w:r>
+        <w:fldChar w:fldCharType="separate"/>
+      </w:r>
+      <w:r>
+        <w:rPr>
+          <w:noProof/>
+        </w:rPr>
+        <w:t>7</w:t>
+      </w:r>
+      <w:r>
+        <w:fldChar w:fldCharType="end"/>
+      </w:r>
       <w:r>
         <w:t xml:space="preserve">: </w:t>
       </w:r>
@@ -1925,14 +1840,24 @@
       <w:r>
         <w:t xml:space="preserve">Figura </w:t>
       </w:r>
-      <w:fldSimple w:instr=" SEQ Figura \* ARABIC ">
-        <w:r>
-          <w:rPr>
-            <w:noProof/>
-          </w:rPr>
-          <w:t>8</w:t>
-        </w:r>
-      </w:fldSimple>
+      <w:r>
+        <w:fldChar w:fldCharType="begin"/>
+      </w:r>
+      <w:r>
+        <w:instrText xml:space="preserve"> SEQ Figura \* ARABIC </w:instrText>
+      </w:r>
+      <w:r>
+        <w:fldChar w:fldCharType="separate"/>
+      </w:r>
+      <w:r>
+        <w:rPr>
+          <w:noProof/>
+        </w:rPr>
+        <w:t>8</w:t>
+      </w:r>
+      <w:r>
+        <w:fldChar w:fldCharType="end"/>
+      </w:r>
       <w:r>
         <w:t xml:space="preserve">: </w:t>
       </w:r>
@@ -2000,14 +1925,24 @@
       <w:r>
         <w:t xml:space="preserve">Figura </w:t>
       </w:r>
-      <w:fldSimple w:instr=" SEQ Figura \* ARABIC ">
-        <w:r>
-          <w:rPr>
-            <w:noProof/>
-          </w:rPr>
-          <w:t>9</w:t>
-        </w:r>
-      </w:fldSimple>
+      <w:r>
+        <w:fldChar w:fldCharType="begin"/>
+      </w:r>
+      <w:r>
+        <w:instrText xml:space="preserve"> SEQ Figura \* ARABIC </w:instrText>
+      </w:r>
+      <w:r>
+        <w:fldChar w:fldCharType="separate"/>
+      </w:r>
+      <w:r>
+        <w:rPr>
+          <w:noProof/>
+        </w:rPr>
+        <w:t>9</w:t>
+      </w:r>
+      <w:r>
+        <w:fldChar w:fldCharType="end"/>
+      </w:r>
       <w:r>
         <w:t xml:space="preserve">: </w:t>
       </w:r>
@@ -2024,12 +1959,72 @@
       <w:pPr>
         <w:pStyle w:val="Titolo1"/>
       </w:pPr>
-      <w:bookmarkStart w:id="3" w:name="_Toc195104104"/>
+      <w:bookmarkStart w:id="2" w:name="_Toc195104104"/>
+      <w:r>
+        <w:lastRenderedPageBreak/>
+        <w:t>Paginazione AJAX</w:t>
+      </w:r>
+    </w:p>
+    <w:p>
+      <w:r>
+        <w:t>La paginazione tramite AJAX serve a distribuire il carico di lavoro del database, per evitare che vengano scaricate tutte le informazioni ogni volta</w:t>
+      </w:r>
+      <w:r>
+        <w:t>. Nel nostro caso stampiamo 12 prodotti per pagina</w:t>
+      </w:r>
+      <w:r>
+        <w:t xml:space="preserve">, navigabile con una </w:t>
+      </w:r>
+      <w:proofErr w:type="spellStart"/>
+      <w:r>
+        <w:t>navbar</w:t>
+      </w:r>
+      <w:proofErr w:type="spellEnd"/>
+      <w:r>
+        <w:t xml:space="preserve"> di un template di bootstrap</w:t>
+      </w:r>
+      <w:r>
+        <w:t xml:space="preserve"> (</w:t>
+      </w:r>
+      <w:proofErr w:type="spellStart"/>
+      <w:r>
+        <w:t>tailwind.blade.php</w:t>
+      </w:r>
+      <w:proofErr w:type="spellEnd"/>
+      <w:r>
+        <w:t>)</w:t>
+      </w:r>
+      <w:r>
+        <w:t>.</w:t>
+      </w:r>
+      <w:r>
+        <w:t xml:space="preserve"> </w:t>
+      </w:r>
+      <w:bookmarkStart w:id="3" w:name="_GoBack"/>
+      <w:bookmarkEnd w:id="3"/>
+    </w:p>
+    <w:p>
+      <w:pPr>
+        <w:rPr>
+          <w:rFonts w:asciiTheme="majorHAnsi" w:eastAsiaTheme="majorEastAsia" w:hAnsiTheme="majorHAnsi" w:cstheme="majorBidi"/>
+          <w:color w:val="2F5496" w:themeColor="accent1" w:themeShade="BF"/>
+          <w:sz w:val="32"/>
+          <w:szCs w:val="32"/>
+        </w:rPr>
+      </w:pPr>
+      <w:r>
+        <w:br w:type="page"/>
+      </w:r>
+    </w:p>
+    <w:p>
+      <w:pPr>
+        <w:pStyle w:val="Titolo1"/>
+      </w:pPr>
       <w:r>
         <w:lastRenderedPageBreak/>
         <w:t>Test</w:t>
       </w:r>
-      <w:bookmarkEnd w:id="3"/>
+      <w:bookmarkEnd w:id="2"/>
     </w:p>
     <w:p>
       <w:r>

</xml_diff>

<commit_message>
Documentazione Sprint 5 iniziata
</commit_message>
<xml_diff>
--- a/3_Documentazione/da aggiungere alla doc sprint 3.docx
+++ b/3_Documentazione/da aggiungere alla doc sprint 3.docx
@@ -238,13 +238,13 @@
                   </wp:anchor>
                 </w:drawing>
               </mc:Choice>
-              <mc:Fallback xmlns:w16sdtfl="http://schemas.microsoft.com/office/word/2024/wordml/sdtformatlock" xmlns:w16sdtdh="http://schemas.microsoft.com/office/word/2020/wordml/sdtdatahash" xmlns:w16du="http://schemas.microsoft.com/office/word/2023/wordml/word16du" xmlns:w16="http://schemas.microsoft.com/office/word/2018/wordml" xmlns:w16cex="http://schemas.microsoft.com/office/word/2018/wordml/cex" xmlns:oel="http://schemas.microsoft.com/office/2019/extlst">
+              <mc:Fallback>
                 <w:pict>
                   <v:shapetype w14:anchorId="7FF8355A" id="_x0000_t202" coordsize="21600,21600" o:spt="202" path="m,l,21600r21600,l21600,xe">
                     <v:stroke joinstyle="miter"/>
                     <v:path gradientshapeok="t" o:connecttype="rect"/>
                   </v:shapetype>
-                  <v:shape id="Casella di testo 131" o:spid="_x0000_s1026" type="#_x0000_t202" style="position:absolute;margin-left:0;margin-top:0;width:369pt;height:529.2pt;z-index:251660288;visibility:visible;mso-wrap-style:square;mso-width-percent:790;mso-height-percent:350;mso-left-percent:77;mso-top-percent:540;mso-wrap-distance-left:14.4pt;mso-wrap-distance-top:0;mso-wrap-distance-right:14.4pt;mso-wrap-distance-bottom:0;mso-position-horizontal-relative:margin;mso-position-vertical-relative:page;mso-width-percent:790;mso-height-percent:350;mso-left-percent:77;mso-top-percent:540;mso-width-relative:margin;mso-height-relative:page;v-text-anchor:top" o:gfxdata="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" filled="f" stroked="f" strokeweight=".5pt">
+                  <v:shape id="Casella di testo 131" o:spid="_x0000_s1026" type="#_x0000_t202" style="position:absolute;margin-left:0;margin-top:0;width:369pt;height:529.2pt;z-index:251660288;visibility:visible;mso-wrap-style:square;mso-width-percent:790;mso-height-percent:350;mso-left-percent:77;mso-top-percent:540;mso-wrap-distance-left:14.4pt;mso-wrap-distance-top:0;mso-wrap-distance-right:14.4pt;mso-wrap-distance-bottom:0;mso-position-horizontal-relative:margin;mso-position-vertical-relative:page;mso-width-percent:790;mso-height-percent:350;mso-left-percent:77;mso-top-percent:540;mso-width-relative:margin;mso-height-relative:page;v-text-anchor:top" o:gfxdata="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" filled="f" stroked="f" strokeweight=".5pt">
                     <v:textbox style="mso-fit-shape-to-text:t" inset="0,0,0,0">
                       <w:txbxContent>
                         <w:p>
@@ -270,6 +270,7 @@
                               <w:dataBinding w:prefixMappings="xmlns:ns0='http://purl.org/dc/elements/1.1/' xmlns:ns1='http://schemas.openxmlformats.org/package/2006/metadata/core-properties' " w:xpath="/ns1:coreProperties[1]/ns0:title[1]" w:storeItemID="{6C3C8BC8-F283-45AE-878A-BAB7291924A1}"/>
                               <w:text/>
                             </w:sdtPr>
+                            <w:sdtEndPr/>
                             <w:sdtContent>
                               <w:r>
                                 <w:rPr>
@@ -296,6 +297,7 @@
                             <w:dataBinding w:prefixMappings="xmlns:ns0='http://purl.org/dc/elements/1.1/' xmlns:ns1='http://schemas.openxmlformats.org/package/2006/metadata/core-properties' " w:xpath="/ns1:coreProperties[1]/ns0:subject[1]" w:storeItemID="{6C3C8BC8-F283-45AE-878A-BAB7291924A1}"/>
                             <w:text/>
                           </w:sdtPr>
+                          <w:sdtEndPr/>
                           <w:sdtContent>
                             <w:p>
                               <w:pPr>
@@ -334,6 +336,7 @@
                             <w:dataBinding w:prefixMappings="xmlns:ns0='http://purl.org/dc/elements/1.1/' xmlns:ns1='http://schemas.openxmlformats.org/package/2006/metadata/core-properties' " w:xpath="/ns1:coreProperties[1]/ns0:creator[1]" w:storeItemID="{6C3C8BC8-F283-45AE-878A-BAB7291924A1}"/>
                             <w:text/>
                           </w:sdtPr>
+                          <w:sdtEndPr/>
                           <w:sdtContent>
                             <w:p>
                               <w:pPr>
@@ -495,9 +498,9 @@
                   </wp:anchor>
                 </w:drawing>
               </mc:Choice>
-              <mc:Fallback xmlns:w16sdtfl="http://schemas.microsoft.com/office/word/2024/wordml/sdtformatlock" xmlns:w16sdtdh="http://schemas.microsoft.com/office/word/2020/wordml/sdtdatahash" xmlns:w16du="http://schemas.microsoft.com/office/word/2023/wordml/word16du" xmlns:w16="http://schemas.microsoft.com/office/word/2018/wordml" xmlns:w16cex="http://schemas.microsoft.com/office/word/2018/wordml/cex" xmlns:oel="http://schemas.microsoft.com/office/2019/extlst">
+              <mc:Fallback>
                 <w:pict>
-                  <v:rect w14:anchorId="278F02FD" id="Rettangolo 132" o:spid="_x0000_s1027" style="position:absolute;margin-left:-4.4pt;margin-top:0;width:46.8pt;height:77.75pt;z-index:251659264;visibility:visible;mso-wrap-style:square;mso-width-percent:76;mso-height-percent:98;mso-top-percent:23;mso-wrap-distance-left:9pt;mso-wrap-distance-top:0;mso-wrap-distance-right:9pt;mso-wrap-distance-bottom:0;mso-position-horizontal:right;mso-position-horizontal-relative:margin;mso-position-vertical-relative:page;mso-width-percent:76;mso-height-percent:98;mso-top-percent:23;mso-width-relative:page;mso-height-relative:page;v-text-anchor:bottom" o:gfxdata="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" fillcolor="#4472c4 [3204]" stroked="f" strokeweight="1pt">
+                  <v:rect w14:anchorId="278F02FD" id="Rettangolo 132" o:spid="_x0000_s1027" style="position:absolute;margin-left:-4.4pt;margin-top:0;width:46.8pt;height:77.75pt;z-index:251659264;visibility:visible;mso-wrap-style:square;mso-width-percent:76;mso-height-percent:98;mso-top-percent:23;mso-wrap-distance-left:9pt;mso-wrap-distance-top:0;mso-wrap-distance-right:9pt;mso-wrap-distance-bottom:0;mso-position-horizontal:right;mso-position-horizontal-relative:margin;mso-position-vertical-relative:page;mso-width-percent:76;mso-height-percent:98;mso-top-percent:23;mso-width-relative:page;mso-height-relative:page;v-text-anchor:bottom" o:gfxdata="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" fillcolor="#4472c4 [3204]" stroked="f" strokeweight="1pt">
                     <o:lock v:ext="edit" aspectratio="t"/>
                     <v:textbox inset="3.6pt,,3.6pt">
                       <w:txbxContent>
@@ -519,6 +522,7 @@
                               <w:calendar w:val="gregorian"/>
                             </w:date>
                           </w:sdtPr>
+                          <w:sdtEndPr/>
                           <w:sdtContent>
                             <w:p>
                               <w:pPr>
@@ -922,7 +926,21 @@
         <w:rPr>
           <w:rFonts w:cstheme="minorHAnsi"/>
         </w:rPr>
-        <w:t xml:space="preserve">”, contenente un form che richiede l’inserimento di informazioni e immagini del prodotto. Una volta inviati i dati, questi vengono passati tramite POST al metodo </w:t>
+        <w:t xml:space="preserve">”, contenente un </w:t>
+      </w:r>
+      <w:proofErr w:type="spellStart"/>
+      <w:r>
+        <w:rPr>
+          <w:rFonts w:cstheme="minorHAnsi"/>
+        </w:rPr>
+        <w:t>form</w:t>
+      </w:r>
+      <w:proofErr w:type="spellEnd"/>
+      <w:r>
+        <w:rPr>
+          <w:rFonts w:cstheme="minorHAnsi"/>
+        </w:rPr>
+        <w:t xml:space="preserve"> che richiede l’inserimento di informazioni e immagini del prodotto. Una volta inviati i dati, questi vengono passati tramite POST al metodo </w:t>
       </w:r>
       <w:proofErr w:type="gramStart"/>
       <w:r>
@@ -2098,7 +2116,21 @@
         <w:rPr>
           <w:rFonts w:cstheme="minorHAnsi"/>
         </w:rPr>
-        <w:t>” dal form)</w:t>
+        <w:t xml:space="preserve">” dal </w:t>
+      </w:r>
+      <w:proofErr w:type="spellStart"/>
+      <w:r>
+        <w:rPr>
+          <w:rFonts w:cstheme="minorHAnsi"/>
+        </w:rPr>
+        <w:t>form</w:t>
+      </w:r>
+      <w:proofErr w:type="spellEnd"/>
+      <w:r>
+        <w:rPr>
+          <w:rFonts w:cstheme="minorHAnsi"/>
+        </w:rPr>
+        <w:t>)</w:t>
       </w:r>
     </w:p>
     <w:p>
@@ -2335,417 +2367,9 @@
           <w:rFonts w:cstheme="minorHAnsi"/>
         </w:rPr>
       </w:pPr>
-      <w:r>
-        <w:rPr>
-          <w:rFonts w:cstheme="minorHAnsi"/>
-        </w:rPr>
-        <w:br w:type="page"/>
-      </w:r>
-    </w:p>
-    <w:p>
-      <w:pPr>
-        <w:pStyle w:val="Titolo1"/>
-        <w:rPr>
-          <w:rFonts w:asciiTheme="minorHAnsi" w:hAnsiTheme="minorHAnsi" w:cstheme="minorHAnsi"/>
-        </w:rPr>
-      </w:pPr>
       <w:bookmarkStart w:id="2" w:name="_Toc195104104"/>
-      <w:r>
-        <w:rPr>
-          <w:rFonts w:asciiTheme="minorHAnsi" w:hAnsiTheme="minorHAnsi" w:cstheme="minorHAnsi"/>
-        </w:rPr>
-        <w:lastRenderedPageBreak/>
-        <w:t>Paginazione AJAX</w:t>
-      </w:r>
-    </w:p>
-    <w:p>
-      <w:pPr>
-        <w:rPr>
-          <w:rFonts w:cstheme="minorHAnsi"/>
-        </w:rPr>
-      </w:pPr>
-      <w:r>
-        <w:rPr>
-          <w:rFonts w:cstheme="minorHAnsi"/>
-        </w:rPr>
-        <w:t>La paginazione tramite AJAX serve a distribuire il carico di lavoro del database, per evitare che vengano scaricate tutte le informazioni ogni volta</w:t>
-      </w:r>
-      <w:r>
-        <w:rPr>
-          <w:rFonts w:cstheme="minorHAnsi"/>
-        </w:rPr>
-        <w:t>. Nel nostro caso stampiamo 12 prodotti per pagina</w:t>
-      </w:r>
-      <w:r>
-        <w:rPr>
-          <w:rFonts w:cstheme="minorHAnsi"/>
-        </w:rPr>
-        <w:t xml:space="preserve">, navigabile con una </w:t>
-      </w:r>
-      <w:proofErr w:type="spellStart"/>
-      <w:r>
-        <w:rPr>
-          <w:rFonts w:cstheme="minorHAnsi"/>
-        </w:rPr>
-        <w:t>navbar</w:t>
-      </w:r>
-      <w:proofErr w:type="spellEnd"/>
-      <w:r>
-        <w:rPr>
-          <w:rFonts w:cstheme="minorHAnsi"/>
-        </w:rPr>
-        <w:t xml:space="preserve"> di un template di bootstrap</w:t>
-      </w:r>
-      <w:r>
-        <w:rPr>
-          <w:rFonts w:cstheme="minorHAnsi"/>
-        </w:rPr>
-        <w:t xml:space="preserve"> (</w:t>
-      </w:r>
-      <w:proofErr w:type="spellStart"/>
-      <w:r>
-        <w:rPr>
-          <w:rFonts w:cstheme="minorHAnsi"/>
-        </w:rPr>
-        <w:t>tailwind.blade.php</w:t>
-      </w:r>
-      <w:proofErr w:type="spellEnd"/>
-      <w:r>
-        <w:rPr>
-          <w:rFonts w:cstheme="minorHAnsi"/>
-        </w:rPr>
-        <w:t>)</w:t>
-      </w:r>
-      <w:r>
-        <w:rPr>
-          <w:rFonts w:cstheme="minorHAnsi"/>
-        </w:rPr>
-        <w:t>.</w:t>
-      </w:r>
-      <w:r>
-        <w:rPr>
-          <w:rFonts w:cstheme="minorHAnsi"/>
-        </w:rPr>
-        <w:t xml:space="preserve"> </w:t>
-      </w:r>
-    </w:p>
-    <w:p>
-      <w:pPr>
-        <w:rPr>
-          <w:rFonts w:cstheme="minorHAnsi"/>
-        </w:rPr>
-      </w:pPr>
-      <w:r>
-        <w:rPr>
-          <w:rFonts w:cstheme="minorHAnsi"/>
-        </w:rPr>
-        <w:t>Nel percorso app/http/Controllers è stato creato un Controller chiamato “</w:t>
-      </w:r>
-      <w:proofErr w:type="spellStart"/>
-      <w:r>
-        <w:rPr>
-          <w:rFonts w:cstheme="minorHAnsi"/>
-        </w:rPr>
-        <w:t>CatalogController</w:t>
-      </w:r>
-      <w:proofErr w:type="spellEnd"/>
-      <w:r>
-        <w:rPr>
-          <w:rFonts w:cstheme="minorHAnsi"/>
-        </w:rPr>
-        <w:t>” che possiede un metodo index che si occupa di quanto descritto in precedenza.</w:t>
-      </w:r>
-    </w:p>
-    <w:p>
-      <w:pPr>
-        <w:keepNext/>
-        <w:jc w:val="center"/>
-        <w:rPr>
-          <w:rFonts w:cstheme="minorHAnsi"/>
-        </w:rPr>
-      </w:pPr>
-      <w:r>
-        <w:rPr>
-          <w:rFonts w:cstheme="minorHAnsi"/>
-          <w:noProof/>
-        </w:rPr>
-        <w:drawing>
-          <wp:inline distT="0" distB="0" distL="0" distR="0" wp14:anchorId="472B36B6" wp14:editId="300465EF">
-            <wp:extent cx="4749502" cy="3760967"/>
-            <wp:effectExtent l="0" t="0" r="0" b="0"/>
-            <wp:docPr id="1952014732" name="Immagine 1"/>
-            <wp:cNvGraphicFramePr>
-              <a:graphicFrameLocks xmlns:a="http://schemas.openxmlformats.org/drawingml/2006/main" noChangeAspect="1"/>
-            </wp:cNvGraphicFramePr>
-            <a:graphic xmlns:a="http://schemas.openxmlformats.org/drawingml/2006/main">
-              <a:graphicData uri="http://schemas.openxmlformats.org/drawingml/2006/picture">
-                <pic:pic xmlns:pic="http://schemas.openxmlformats.org/drawingml/2006/picture">
-                  <pic:nvPicPr>
-                    <pic:cNvPr id="1952014732" name=""/>
-                    <pic:cNvPicPr/>
-                  </pic:nvPicPr>
-                  <pic:blipFill>
-                    <a:blip r:embed="rId18"/>
-                    <a:stretch>
-                      <a:fillRect/>
-                    </a:stretch>
-                  </pic:blipFill>
-                  <pic:spPr>
-                    <a:xfrm>
-                      <a:off x="0" y="0"/>
-                      <a:ext cx="4761445" cy="3770424"/>
-                    </a:xfrm>
-                    <a:prstGeom prst="rect">
-                      <a:avLst/>
-                    </a:prstGeom>
-                  </pic:spPr>
-                </pic:pic>
-              </a:graphicData>
-            </a:graphic>
-          </wp:inline>
-        </w:drawing>
-      </w:r>
-    </w:p>
-    <w:p>
-      <w:pPr>
-        <w:pStyle w:val="Didascalia"/>
-        <w:jc w:val="center"/>
-        <w:rPr>
-          <w:rFonts w:cstheme="minorHAnsi"/>
-        </w:rPr>
-      </w:pPr>
-      <w:r>
-        <w:rPr>
-          <w:rFonts w:cstheme="minorHAnsi"/>
-        </w:rPr>
-        <w:t xml:space="preserve">Figura </w:t>
-      </w:r>
-      <w:r>
-        <w:rPr>
-          <w:rFonts w:cstheme="minorHAnsi"/>
-        </w:rPr>
-        <w:fldChar w:fldCharType="begin"/>
-      </w:r>
-      <w:r>
-        <w:rPr>
-          <w:rFonts w:cstheme="minorHAnsi"/>
-        </w:rPr>
-        <w:instrText xml:space="preserve"> SEQ Figura \* ARABIC </w:instrText>
-      </w:r>
-      <w:r>
-        <w:rPr>
-          <w:rFonts w:cstheme="minorHAnsi"/>
-        </w:rPr>
-        <w:fldChar w:fldCharType="separate"/>
-      </w:r>
-      <w:r>
-        <w:rPr>
-          <w:rFonts w:cstheme="minorHAnsi"/>
-          <w:noProof/>
-        </w:rPr>
-        <w:t>10</w:t>
-      </w:r>
-      <w:r>
-        <w:rPr>
-          <w:rFonts w:cstheme="minorHAnsi"/>
-        </w:rPr>
-        <w:fldChar w:fldCharType="end"/>
-      </w:r>
-      <w:r>
-        <w:rPr>
-          <w:rFonts w:cstheme="minorHAnsi"/>
-        </w:rPr>
-        <w:t xml:space="preserve">: Metodo </w:t>
-      </w:r>
-      <w:proofErr w:type="spellStart"/>
-      <w:r>
-        <w:rPr>
-          <w:rFonts w:cstheme="minorHAnsi"/>
-        </w:rPr>
-        <w:t>index</w:t>
-      </w:r>
-      <w:proofErr w:type="spellEnd"/>
-      <w:r>
-        <w:rPr>
-          <w:rFonts w:cstheme="minorHAnsi"/>
-        </w:rPr>
-        <w:t xml:space="preserve"> del </w:t>
-      </w:r>
-      <w:proofErr w:type="spellStart"/>
-      <w:r>
-        <w:rPr>
-          <w:rFonts w:cstheme="minorHAnsi"/>
-        </w:rPr>
-        <w:t>CatalogController</w:t>
-      </w:r>
-      <w:proofErr w:type="spellEnd"/>
-    </w:p>
-    <w:p>
-      <w:pPr>
-        <w:rPr>
-          <w:rFonts w:cstheme="minorHAnsi"/>
-        </w:rPr>
-      </w:pPr>
-      <w:r>
-        <w:rPr>
-          <w:rFonts w:cstheme="minorHAnsi"/>
-        </w:rPr>
-        <w:t xml:space="preserve">All’interno del file </w:t>
-      </w:r>
-      <w:proofErr w:type="spellStart"/>
-      <w:r>
-        <w:rPr>
-          <w:rFonts w:cstheme="minorHAnsi"/>
-        </w:rPr>
-        <w:t>web.php</w:t>
-      </w:r>
-      <w:proofErr w:type="spellEnd"/>
-      <w:r>
-        <w:rPr>
-          <w:rFonts w:cstheme="minorHAnsi"/>
-        </w:rPr>
-        <w:t xml:space="preserve"> è stata aggiunta una rotta dedicata per le richieste AJAX, la quale va a richiamare il metodo </w:t>
-      </w:r>
-      <w:proofErr w:type="spellStart"/>
-      <w:r>
-        <w:rPr>
-          <w:rFonts w:cstheme="minorHAnsi"/>
-        </w:rPr>
-        <w:t>index</w:t>
-      </w:r>
-      <w:proofErr w:type="spellEnd"/>
-      <w:r>
-        <w:rPr>
-          <w:rFonts w:cstheme="minorHAnsi"/>
-        </w:rPr>
-        <w:t xml:space="preserve"> del </w:t>
-      </w:r>
-      <w:proofErr w:type="spellStart"/>
-      <w:r>
-        <w:rPr>
-          <w:rFonts w:cstheme="minorHAnsi"/>
-        </w:rPr>
-        <w:t>CatalogController</w:t>
-      </w:r>
-      <w:proofErr w:type="spellEnd"/>
-      <w:r>
-        <w:rPr>
-          <w:rFonts w:cstheme="minorHAnsi"/>
-        </w:rPr>
-        <w:t>.</w:t>
-      </w:r>
-    </w:p>
-    <w:p>
-      <w:pPr>
-        <w:keepNext/>
-        <w:jc w:val="center"/>
-        <w:rPr>
-          <w:rFonts w:cstheme="minorHAnsi"/>
-        </w:rPr>
-      </w:pPr>
-      <w:r>
-        <w:rPr>
-          <w:rFonts w:cstheme="minorHAnsi"/>
-          <w:noProof/>
-        </w:rPr>
-        <w:drawing>
-          <wp:inline distT="0" distB="0" distL="0" distR="0" wp14:anchorId="5EB90879" wp14:editId="3EF2E01D">
-            <wp:extent cx="4644529" cy="588397"/>
-            <wp:effectExtent l="0" t="0" r="3810" b="2540"/>
-            <wp:docPr id="956636656" name="Immagine 1"/>
-            <wp:cNvGraphicFramePr>
-              <a:graphicFrameLocks xmlns:a="http://schemas.openxmlformats.org/drawingml/2006/main" noChangeAspect="1"/>
-            </wp:cNvGraphicFramePr>
-            <a:graphic xmlns:a="http://schemas.openxmlformats.org/drawingml/2006/main">
-              <a:graphicData uri="http://schemas.openxmlformats.org/drawingml/2006/picture">
-                <pic:pic xmlns:pic="http://schemas.openxmlformats.org/drawingml/2006/picture">
-                  <pic:nvPicPr>
-                    <pic:cNvPr id="956636656" name=""/>
-                    <pic:cNvPicPr/>
-                  </pic:nvPicPr>
-                  <pic:blipFill>
-                    <a:blip r:embed="rId19"/>
-                    <a:stretch>
-                      <a:fillRect/>
-                    </a:stretch>
-                  </pic:blipFill>
-                  <pic:spPr>
-                    <a:xfrm>
-                      <a:off x="0" y="0"/>
-                      <a:ext cx="4718769" cy="597802"/>
-                    </a:xfrm>
-                    <a:prstGeom prst="rect">
-                      <a:avLst/>
-                    </a:prstGeom>
-                  </pic:spPr>
-                </pic:pic>
-              </a:graphicData>
-            </a:graphic>
-          </wp:inline>
-        </w:drawing>
-      </w:r>
-    </w:p>
-    <w:p>
-      <w:pPr>
-        <w:pStyle w:val="Didascalia"/>
-        <w:jc w:val="center"/>
-        <w:rPr>
-          <w:rFonts w:cstheme="minorHAnsi"/>
-        </w:rPr>
-      </w:pPr>
-      <w:r>
-        <w:rPr>
-          <w:rFonts w:cstheme="minorHAnsi"/>
-        </w:rPr>
-        <w:t xml:space="preserve">Figura </w:t>
-      </w:r>
-      <w:r>
-        <w:rPr>
-          <w:rFonts w:cstheme="minorHAnsi"/>
-        </w:rPr>
-        <w:fldChar w:fldCharType="begin"/>
-      </w:r>
-      <w:r>
-        <w:rPr>
-          <w:rFonts w:cstheme="minorHAnsi"/>
-        </w:rPr>
-        <w:instrText xml:space="preserve"> SEQ Figura \* ARABIC </w:instrText>
-      </w:r>
-      <w:r>
-        <w:rPr>
-          <w:rFonts w:cstheme="minorHAnsi"/>
-        </w:rPr>
-        <w:fldChar w:fldCharType="separate"/>
-      </w:r>
-      <w:r>
-        <w:rPr>
-          <w:rFonts w:cstheme="minorHAnsi"/>
-          <w:noProof/>
-        </w:rPr>
-        <w:t>11</w:t>
-      </w:r>
-      <w:r>
-        <w:rPr>
-          <w:rFonts w:cstheme="minorHAnsi"/>
-        </w:rPr>
-        <w:fldChar w:fldCharType="end"/>
-      </w:r>
-      <w:r>
-        <w:rPr>
-          <w:rFonts w:cstheme="minorHAnsi"/>
-        </w:rPr>
-        <w:t>: Rotta per richieste AJAX</w:t>
-      </w:r>
-    </w:p>
-    <w:p>
-      <w:pPr>
-        <w:rPr>
-          <w:rFonts w:eastAsiaTheme="majorEastAsia" w:cstheme="minorHAnsi"/>
-          <w:color w:val="2F5496" w:themeColor="accent1" w:themeShade="BF"/>
-          <w:sz w:val="32"/>
-          <w:szCs w:val="32"/>
-        </w:rPr>
-      </w:pPr>
+      <w:bookmarkStart w:id="3" w:name="_GoBack"/>
+      <w:bookmarkEnd w:id="3"/>
       <w:r>
         <w:rPr>
           <w:rFonts w:cstheme="minorHAnsi"/>
@@ -2884,7 +2508,7 @@
                     <pic:cNvPicPr/>
                   </pic:nvPicPr>
                   <pic:blipFill>
-                    <a:blip r:embed="rId20"/>
+                    <a:blip r:embed="rId18"/>
                     <a:stretch>
                       <a:fillRect/>
                     </a:stretch>
@@ -3035,7 +2659,7 @@
                     <pic:cNvPicPr/>
                   </pic:nvPicPr>
                   <pic:blipFill>
-                    <a:blip r:embed="rId21"/>
+                    <a:blip r:embed="rId19"/>
                     <a:stretch>
                       <a:fillRect/>
                     </a:stretch>
@@ -3178,7 +2802,7 @@
                     <pic:cNvPicPr/>
                   </pic:nvPicPr>
                   <pic:blipFill>
-                    <a:blip r:embed="rId22"/>
+                    <a:blip r:embed="rId20"/>
                     <a:stretch>
                       <a:fillRect/>
                     </a:stretch>
@@ -5239,7 +4863,7 @@
             </w:pPr>
             <w:r>
               <w:rPr>
-                <w:rFonts w:asciiTheme="minorHAnsi" w:hAnsiTheme="minorHAnsi" w:cstheme="minorHAnsi"/>
+                <w:rFonts w:cstheme="minorHAnsi"/>
                 <w:noProof/>
               </w:rPr>
               <w:drawing>
@@ -5274,7 +4898,7 @@
                           <pic:cNvPicPr/>
                         </pic:nvPicPr>
                         <pic:blipFill>
-                          <a:blip r:embed="rId23" cstate="print">
+                          <a:blip r:embed="rId21" cstate="print">
                             <a:extLst>
                               <a:ext uri="{28A0092B-C50C-407E-A947-70E740481C1C}">
                                 <a14:useLocalDpi xmlns:a14="http://schemas.microsoft.com/office/drawing/2010/main" val="0"/>
@@ -5419,8 +5043,6 @@
                 <w:lang w:val="it-IT"/>
               </w:rPr>
             </w:pPr>
-            <w:bookmarkStart w:id="3" w:name="_GoBack"/>
-            <w:bookmarkEnd w:id="3"/>
             <w:r>
               <w:rPr>
                 <w:rFonts w:asciiTheme="minorHAnsi" w:hAnsiTheme="minorHAnsi" w:cstheme="minorHAnsi"/>
@@ -5715,7 +5337,7 @@
             </w:pPr>
             <w:r>
               <w:rPr>
-                <w:rFonts w:asciiTheme="minorHAnsi" w:hAnsiTheme="minorHAnsi" w:cstheme="minorHAnsi"/>
+                <w:rFonts w:cstheme="minorHAnsi"/>
                 <w:noProof/>
               </w:rPr>
               <w:drawing>
@@ -5734,7 +5356,7 @@
                           <pic:cNvPicPr/>
                         </pic:nvPicPr>
                         <pic:blipFill>
-                          <a:blip r:embed="rId24"/>
+                          <a:blip r:embed="rId22"/>
                           <a:stretch>
                             <a:fillRect/>
                           </a:stretch>
@@ -5872,8 +5494,8 @@
       </w:pPr>
     </w:p>
     <w:sectPr>
-      <w:headerReference w:type="default" r:id="rId25"/>
-      <w:footerReference w:type="default" r:id="rId26"/>
+      <w:headerReference w:type="default" r:id="rId23"/>
+      <w:footerReference w:type="default" r:id="rId24"/>
       <w:pgSz w:w="11906" w:h="16838"/>
       <w:pgMar w:top="1417" w:right="1134" w:bottom="1134" w:left="1134" w:header="708" w:footer="708" w:gutter="0"/>
       <w:pgNumType w:start="0"/>
@@ -7638,7 +7260,7 @@
 </file>
 
 <file path=customXml/itemProps2.xml><?xml version="1.0" encoding="utf-8"?>
-<ds:datastoreItem xmlns:ds="http://schemas.openxmlformats.org/officeDocument/2006/customXml" ds:itemID="{8CD06178-A324-4526-ADB8-409EE1D6ECD5}">
+<ds:datastoreItem xmlns:ds="http://schemas.openxmlformats.org/officeDocument/2006/customXml" ds:itemID="{07BA5120-3751-4D81-AC96-FE18F7096DDA}">
   <ds:schemaRefs>
     <ds:schemaRef ds:uri="http://schemas.openxmlformats.org/officeDocument/2006/bibliography"/>
   </ds:schemaRefs>

</xml_diff>